<commit_message>
Update technical roadmap to actual stack: Flutter + Laravel + ZID
- Correct mobile to Flutter (single Dart codebase), backend to Laravel
- Add ZID commerce platform + WebView + session/cookie bridge to architecture
- Add Section 2.1 current backend build plan (real Jun-Jul 2026 workstreams)
- Update module, phase, team, and recommendation sections accordingly

Co-Authored-By: Claude Opus 4.8 <noreply@anthropic.com>
</commit_message>
<xml_diff>
--- a/Haddiya_Technical_Roadmap.docx
+++ b/Haddiya_Technical_Roadmap.docx
@@ -394,6 +394,21 @@
     </w:p>
     <w:p>
       <w:pPr>
+        <w:spacing w:after="80"/>
+      </w:pPr>
+      <w:r>
+        <w:rPr>
+          <w:rFonts w:ascii="Calibri" w:hAnsi="Calibri"/>
+          <w:b w:val="0"/>
+          <w:i w:val="0"/>
+          <w:color w:val="1C1C1E"/>
+          <w:sz w:val="22"/>
+        </w:rPr>
+        <w:t>Technically, Haddiya is delivered as a cross-platform Flutter application (a single Dart codebase for both iOS and Android) backed by a Laravel (PHP) service layer that integrates with the ZID commerce platform as the storefront and order engine. The Laravel layer owns session and cookie handling, the ZID WebView bridge, the cart and checkout flow, guest checkout, and API ownership between the Flutter client and ZID.</w:t>
+      </w:r>
+    </w:p>
+    <w:p>
+      <w:pPr>
         <w:pStyle w:val="Heading2"/>
       </w:pPr>
       <w:r>
@@ -1148,7 +1163,7 @@
                 <w:color w:val="1C1C1E"/>
                 <w:sz w:val="20"/>
               </w:rPr>
-              <w:t>Consumer Channels</w:t>
+              <w:t>Client Apps</w:t>
             </w:r>
           </w:p>
         </w:tc>
@@ -1174,7 +1189,7 @@
                 <w:color w:val="1C1C1E"/>
                 <w:sz w:val="20"/>
               </w:rPr>
-              <w:t>iOS App, Android App, Mobile Web (PWA), Desktop Web</w:t>
+              <w:t>Flutter app — single Dart codebase for iOS + Android; Mobile Web; Desktop Web</w:t>
             </w:r>
           </w:p>
         </w:tc>
@@ -1203,7 +1218,7 @@
                 <w:color w:val="1C1C1E"/>
                 <w:sz w:val="20"/>
               </w:rPr>
-              <w:t>API Gateway / BFF</w:t>
+              <w:t>Backend (Laravel)</w:t>
             </w:r>
           </w:p>
         </w:tc>
@@ -1230,7 +1245,7 @@
                 <w:color w:val="1C1C1E"/>
                 <w:sz w:val="20"/>
               </w:rPr>
-              <w:t>Auth, rate-limiting, localization, routing</w:t>
+              <w:t>PHP service layer: session/cookie handling, ZID API ownership, cart + checkout flow, guest flow</w:t>
             </w:r>
           </w:p>
         </w:tc>
@@ -1258,7 +1273,7 @@
                 <w:color w:val="1C1C1E"/>
                 <w:sz w:val="20"/>
               </w:rPr>
-              <w:t>Core Commerce</w:t>
+              <w:t>Commerce Platform (ZID)</w:t>
             </w:r>
           </w:p>
         </w:tc>
@@ -1284,7 +1299,7 @@
                 <w:color w:val="1C1C1E"/>
                 <w:sz w:val="20"/>
               </w:rPr>
-              <w:t>Catalog, cart, pricing, orders, payments, shipping, wishlist, checkout</w:t>
+              <w:t>Storefront, catalog, orders, payments — consumed via headless APIs + WebView</w:t>
             </w:r>
           </w:p>
         </w:tc>
@@ -1313,7 +1328,7 @@
                 <w:color w:val="1C1C1E"/>
                 <w:sz w:val="20"/>
               </w:rPr>
-              <w:t>Vendor Portal</w:t>
+              <w:t>API Gateway / BFF</w:t>
             </w:r>
           </w:p>
         </w:tc>
@@ -1340,7 +1355,7 @@
                 <w:color w:val="1C1C1E"/>
                 <w:sz w:val="20"/>
               </w:rPr>
-              <w:t>Onboarding, inventory, orders, earnings</w:t>
+              <w:t>Auth, rate-limiting, localization, routing between Flutter client and services</w:t>
             </w:r>
           </w:p>
         </w:tc>
@@ -1368,7 +1383,7 @@
                 <w:color w:val="1C1C1E"/>
                 <w:sz w:val="20"/>
               </w:rPr>
-              <w:t>Admin CMS</w:t>
+              <w:t>Vendor Portal</w:t>
             </w:r>
           </w:p>
         </w:tc>
@@ -1394,7 +1409,7 @@
                 <w:color w:val="1C1C1E"/>
                 <w:sz w:val="20"/>
               </w:rPr>
-              <w:t>Ops, catalog moderation, reports, vendor management</w:t>
+              <w:t>Onboarding, inventory, orders, earnings</w:t>
             </w:r>
           </w:p>
         </w:tc>
@@ -1423,7 +1438,7 @@
                 <w:color w:val="1C1C1E"/>
                 <w:sz w:val="20"/>
               </w:rPr>
-              <w:t>Intelligence Layer</w:t>
+              <w:t>Admin CMS</w:t>
             </w:r>
           </w:p>
         </w:tc>
@@ -1450,7 +1465,7 @@
                 <w:color w:val="1C1C1E"/>
                 <w:sz w:val="20"/>
               </w:rPr>
-              <w:t>Gift AI Assistant, recommendations, search ranking, promotion engine</w:t>
+              <w:t>Ops, catalog moderation, reports, vendor management</w:t>
             </w:r>
           </w:p>
         </w:tc>
@@ -1478,6 +1493,61 @@
                 <w:color w:val="1C1C1E"/>
                 <w:sz w:val="20"/>
               </w:rPr>
+              <w:t>Intelligence Layer</w:t>
+            </w:r>
+          </w:p>
+        </w:tc>
+        <w:tc>
+          <w:tcPr>
+            <w:tcW w:type="dxa" w:w="6633"/>
+            <w:tcBorders>
+              <w:top w:val="single" w:sz="4" w:color="CCCCCC"/>
+              <w:left w:val="single" w:sz="4" w:color="CCCCCC"/>
+              <w:bottom w:val="single" w:sz="4" w:color="CCCCCC"/>
+              <w:right w:val="single" w:sz="4" w:color="CCCCCC"/>
+            </w:tcBorders>
+            <w:vAlign w:val="center"/>
+          </w:tcPr>
+          <w:p>
+            <w:pPr>
+              <w:spacing w:before="40" w:after="40"/>
+            </w:pPr>
+            <w:r/>
+            <w:r>
+              <w:rPr>
+                <w:rFonts w:ascii="Calibri" w:hAnsi="Calibri"/>
+                <w:color w:val="1C1C1E"/>
+                <w:sz w:val="20"/>
+              </w:rPr>
+              <w:t>Gift AI Assistant, recommendations, search ranking, promotion engine</w:t>
+            </w:r>
+          </w:p>
+        </w:tc>
+      </w:tr>
+      <w:tr>
+        <w:tc>
+          <w:tcPr>
+            <w:tcW w:type="dxa" w:w="2268"/>
+            <w:tcBorders>
+              <w:top w:val="single" w:sz="4" w:color="CCCCCC"/>
+              <w:left w:val="single" w:sz="4" w:color="CCCCCC"/>
+              <w:bottom w:val="single" w:sz="4" w:color="CCCCCC"/>
+              <w:right w:val="single" w:sz="4" w:color="CCCCCC"/>
+            </w:tcBorders>
+            <w:shd w:val="clear" w:color="auto" w:fill="F5F0EA"/>
+            <w:vAlign w:val="center"/>
+          </w:tcPr>
+          <w:p>
+            <w:pPr>
+              <w:spacing w:before="40" w:after="40"/>
+            </w:pPr>
+            <w:r/>
+            <w:r>
+              <w:rPr>
+                <w:rFonts w:ascii="Calibri" w:hAnsi="Calibri"/>
+                <w:color w:val="1C1C1E"/>
+                <w:sz w:val="20"/>
+              </w:rPr>
               <w:t>Platform Foundation</w:t>
             </w:r>
           </w:p>
@@ -1491,6 +1561,7 @@
               <w:bottom w:val="single" w:sz="4" w:color="CCCCCC"/>
               <w:right w:val="single" w:sz="4" w:color="CCCCCC"/>
             </w:tcBorders>
+            <w:shd w:val="clear" w:color="auto" w:fill="F5F0EA"/>
             <w:vAlign w:val="center"/>
           </w:tcPr>
           <w:p>
@@ -2143,6 +2214,1021 @@
       </w:r>
     </w:p>
     <w:p>
+      <w:pPr>
+        <w:pStyle w:val="Heading2"/>
+      </w:pPr>
+      <w:r>
+        <w:t>2.1 Current Backend Build Plan (Flutter × Laravel × ZID)</w:t>
+      </w:r>
+    </w:p>
+    <w:p>
+      <w:pPr>
+        <w:spacing w:after="80"/>
+      </w:pPr>
+      <w:r>
+        <w:rPr>
+          <w:rFonts w:ascii="Calibri" w:hAnsi="Calibri"/>
+          <w:b w:val="0"/>
+          <w:i w:val="0"/>
+          <w:color w:val="1C1C1E"/>
+          <w:sz w:val="22"/>
+        </w:rPr>
+        <w:t>The frontend (UI/UX and Flutter app) is already designed and built. The table below reflects the active backend execution plan: a Laravel service layer integrating the Flutter client with the ZID storefront via session/cookie handling and a WebView bridge. Dates are the current sprint targets (June–July 2026).</w:t>
+      </w:r>
+    </w:p>
+    <w:tbl>
+      <w:tblPr>
+        <w:tblW w:type="auto" w:w="0"/>
+        <w:jc w:val="center"/>
+        <w:tblLayout w:type="fixed"/>
+        <w:tblLook w:firstColumn="1" w:firstRow="1" w:lastColumn="0" w:lastRow="0" w:noHBand="0" w:noVBand="1" w:val="04A0"/>
+      </w:tblPr>
+      <w:tblGrid>
+        <w:gridCol w:w="2409"/>
+        <w:gridCol w:w="2409"/>
+        <w:gridCol w:w="2409"/>
+        <w:gridCol w:w="2409"/>
+      </w:tblGrid>
+      <w:tr>
+        <w:tc>
+          <w:tcPr>
+            <w:tcW w:type="dxa" w:w="1814"/>
+            <w:shd w:val="clear" w:color="auto" w:fill="7A1E2B"/>
+            <w:tcBorders>
+              <w:top w:val="single" w:sz="4" w:color="CCCCCC"/>
+              <w:left w:val="single" w:sz="4" w:color="CCCCCC"/>
+              <w:bottom w:val="single" w:sz="4" w:color="CCCCCC"/>
+              <w:right w:val="single" w:sz="4" w:color="CCCCCC"/>
+            </w:tcBorders>
+            <w:vAlign w:val="center"/>
+          </w:tcPr>
+          <w:p>
+            <w:pPr>
+              <w:jc w:val="left"/>
+            </w:pPr>
+            <w:r/>
+            <w:r>
+              <w:rPr>
+                <w:rFonts w:ascii="Calibri" w:hAnsi="Calibri"/>
+                <w:b/>
+                <w:color w:val="FFFFFF"/>
+                <w:sz w:val="21"/>
+              </w:rPr>
+              <w:t>Workstream</w:t>
+            </w:r>
+          </w:p>
+        </w:tc>
+        <w:tc>
+          <w:tcPr>
+            <w:tcW w:type="dxa" w:w="1474"/>
+            <w:shd w:val="clear" w:color="auto" w:fill="7A1E2B"/>
+            <w:tcBorders>
+              <w:top w:val="single" w:sz="4" w:color="CCCCCC"/>
+              <w:left w:val="single" w:sz="4" w:color="CCCCCC"/>
+              <w:bottom w:val="single" w:sz="4" w:color="CCCCCC"/>
+              <w:right w:val="single" w:sz="4" w:color="CCCCCC"/>
+            </w:tcBorders>
+            <w:vAlign w:val="center"/>
+          </w:tcPr>
+          <w:p>
+            <w:pPr>
+              <w:jc w:val="left"/>
+            </w:pPr>
+            <w:r/>
+            <w:r>
+              <w:rPr>
+                <w:rFonts w:ascii="Calibri" w:hAnsi="Calibri"/>
+                <w:b/>
+                <w:color w:val="FFFFFF"/>
+                <w:sz w:val="21"/>
+              </w:rPr>
+              <w:t>Target Window</w:t>
+            </w:r>
+          </w:p>
+        </w:tc>
+        <w:tc>
+          <w:tcPr>
+            <w:tcW w:type="dxa" w:w="1134"/>
+            <w:shd w:val="clear" w:color="auto" w:fill="7A1E2B"/>
+            <w:tcBorders>
+              <w:top w:val="single" w:sz="4" w:color="CCCCCC"/>
+              <w:left w:val="single" w:sz="4" w:color="CCCCCC"/>
+              <w:bottom w:val="single" w:sz="4" w:color="CCCCCC"/>
+              <w:right w:val="single" w:sz="4" w:color="CCCCCC"/>
+            </w:tcBorders>
+            <w:vAlign w:val="center"/>
+          </w:tcPr>
+          <w:p>
+            <w:pPr>
+              <w:jc w:val="left"/>
+            </w:pPr>
+            <w:r/>
+            <w:r>
+              <w:rPr>
+                <w:rFonts w:ascii="Calibri" w:hAnsi="Calibri"/>
+                <w:b/>
+                <w:color w:val="FFFFFF"/>
+                <w:sz w:val="21"/>
+              </w:rPr>
+              <w:t>Status</w:t>
+            </w:r>
+          </w:p>
+        </w:tc>
+        <w:tc>
+          <w:tcPr>
+            <w:tcW w:type="dxa" w:w="5046"/>
+            <w:shd w:val="clear" w:color="auto" w:fill="7A1E2B"/>
+            <w:tcBorders>
+              <w:top w:val="single" w:sz="4" w:color="CCCCCC"/>
+              <w:left w:val="single" w:sz="4" w:color="CCCCCC"/>
+              <w:bottom w:val="single" w:sz="4" w:color="CCCCCC"/>
+              <w:right w:val="single" w:sz="4" w:color="CCCCCC"/>
+            </w:tcBorders>
+            <w:vAlign w:val="center"/>
+          </w:tcPr>
+          <w:p>
+            <w:pPr>
+              <w:jc w:val="left"/>
+            </w:pPr>
+            <w:r/>
+            <w:r>
+              <w:rPr>
+                <w:rFonts w:ascii="Calibri" w:hAnsi="Calibri"/>
+                <w:b/>
+                <w:color w:val="FFFFFF"/>
+                <w:sz w:val="21"/>
+              </w:rPr>
+              <w:t>Scope / Deliverables</w:t>
+            </w:r>
+          </w:p>
+        </w:tc>
+      </w:tr>
+      <w:tr>
+        <w:tc>
+          <w:tcPr>
+            <w:tcW w:type="dxa" w:w="1814"/>
+            <w:tcBorders>
+              <w:top w:val="single" w:sz="4" w:color="CCCCCC"/>
+              <w:left w:val="single" w:sz="4" w:color="CCCCCC"/>
+              <w:bottom w:val="single" w:sz="4" w:color="CCCCCC"/>
+              <w:right w:val="single" w:sz="4" w:color="CCCCCC"/>
+            </w:tcBorders>
+            <w:vAlign w:val="center"/>
+          </w:tcPr>
+          <w:p>
+            <w:pPr>
+              <w:spacing w:before="40" w:after="40"/>
+            </w:pPr>
+            <w:r/>
+            <w:r>
+              <w:rPr>
+                <w:rFonts w:ascii="Calibri" w:hAnsi="Calibri"/>
+                <w:color w:val="1C1C1E"/>
+                <w:sz w:val="20"/>
+              </w:rPr>
+              <w:t>Architecture</w:t>
+            </w:r>
+          </w:p>
+        </w:tc>
+        <w:tc>
+          <w:tcPr>
+            <w:tcW w:type="dxa" w:w="1474"/>
+            <w:tcBorders>
+              <w:top w:val="single" w:sz="4" w:color="CCCCCC"/>
+              <w:left w:val="single" w:sz="4" w:color="CCCCCC"/>
+              <w:bottom w:val="single" w:sz="4" w:color="CCCCCC"/>
+              <w:right w:val="single" w:sz="4" w:color="CCCCCC"/>
+            </w:tcBorders>
+            <w:vAlign w:val="center"/>
+          </w:tcPr>
+          <w:p>
+            <w:pPr>
+              <w:spacing w:before="40" w:after="40"/>
+            </w:pPr>
+            <w:r/>
+            <w:r>
+              <w:rPr>
+                <w:rFonts w:ascii="Calibri" w:hAnsi="Calibri"/>
+                <w:color w:val="1C1C1E"/>
+                <w:sz w:val="20"/>
+              </w:rPr>
+              <w:t>Early Jun 2026</w:t>
+            </w:r>
+          </w:p>
+        </w:tc>
+        <w:tc>
+          <w:tcPr>
+            <w:tcW w:type="dxa" w:w="1134"/>
+            <w:tcBorders>
+              <w:top w:val="single" w:sz="4" w:color="CCCCCC"/>
+              <w:left w:val="single" w:sz="4" w:color="CCCCCC"/>
+              <w:bottom w:val="single" w:sz="4" w:color="CCCCCC"/>
+              <w:right w:val="single" w:sz="4" w:color="CCCCCC"/>
+            </w:tcBorders>
+            <w:vAlign w:val="center"/>
+          </w:tcPr>
+          <w:p>
+            <w:pPr>
+              <w:spacing w:before="40" w:after="40"/>
+            </w:pPr>
+            <w:r/>
+            <w:r>
+              <w:rPr>
+                <w:rFonts w:ascii="Calibri" w:hAnsi="Calibri"/>
+                <w:color w:val="1C1C1E"/>
+                <w:sz w:val="20"/>
+              </w:rPr>
+              <w:t>Done</w:t>
+            </w:r>
+          </w:p>
+        </w:tc>
+        <w:tc>
+          <w:tcPr>
+            <w:tcW w:type="dxa" w:w="5046"/>
+            <w:tcBorders>
+              <w:top w:val="single" w:sz="4" w:color="CCCCCC"/>
+              <w:left w:val="single" w:sz="4" w:color="CCCCCC"/>
+              <w:bottom w:val="single" w:sz="4" w:color="CCCCCC"/>
+              <w:right w:val="single" w:sz="4" w:color="CCCCCC"/>
+            </w:tcBorders>
+            <w:vAlign w:val="center"/>
+          </w:tcPr>
+          <w:p>
+            <w:pPr>
+              <w:spacing w:before="40" w:after="40"/>
+            </w:pPr>
+            <w:r/>
+            <w:r>
+              <w:rPr>
+                <w:rFonts w:ascii="Calibri" w:hAnsi="Calibri"/>
+                <w:color w:val="1C1C1E"/>
+                <w:sz w:val="20"/>
+              </w:rPr>
+              <w:t>Flutter → Laravel → ZID; cookie handling; WebView usage; checkout flow; guest flow; API ownership</w:t>
+            </w:r>
+          </w:p>
+        </w:tc>
+      </w:tr>
+      <w:tr>
+        <w:tc>
+          <w:tcPr>
+            <w:tcW w:type="dxa" w:w="1814"/>
+            <w:tcBorders>
+              <w:top w:val="single" w:sz="4" w:color="CCCCCC"/>
+              <w:left w:val="single" w:sz="4" w:color="CCCCCC"/>
+              <w:bottom w:val="single" w:sz="4" w:color="CCCCCC"/>
+              <w:right w:val="single" w:sz="4" w:color="CCCCCC"/>
+            </w:tcBorders>
+            <w:shd w:val="clear" w:color="auto" w:fill="F5F0EA"/>
+            <w:vAlign w:val="center"/>
+          </w:tcPr>
+          <w:p>
+            <w:pPr>
+              <w:spacing w:before="40" w:after="40"/>
+            </w:pPr>
+            <w:r/>
+            <w:r>
+              <w:rPr>
+                <w:rFonts w:ascii="Calibri" w:hAnsi="Calibri"/>
+                <w:color w:val="1C1C1E"/>
+                <w:sz w:val="20"/>
+              </w:rPr>
+              <w:t>Storefront Backend APIs</w:t>
+            </w:r>
+          </w:p>
+        </w:tc>
+        <w:tc>
+          <w:tcPr>
+            <w:tcW w:type="dxa" w:w="1474"/>
+            <w:tcBorders>
+              <w:top w:val="single" w:sz="4" w:color="CCCCCC"/>
+              <w:left w:val="single" w:sz="4" w:color="CCCCCC"/>
+              <w:bottom w:val="single" w:sz="4" w:color="CCCCCC"/>
+              <w:right w:val="single" w:sz="4" w:color="CCCCCC"/>
+            </w:tcBorders>
+            <w:shd w:val="clear" w:color="auto" w:fill="F5F0EA"/>
+            <w:vAlign w:val="center"/>
+          </w:tcPr>
+          <w:p>
+            <w:pPr>
+              <w:spacing w:before="40" w:after="40"/>
+            </w:pPr>
+            <w:r/>
+            <w:r>
+              <w:rPr>
+                <w:rFonts w:ascii="Calibri" w:hAnsi="Calibri"/>
+                <w:color w:val="1C1C1E"/>
+                <w:sz w:val="20"/>
+              </w:rPr>
+              <w:t>7–10 Jun 2026</w:t>
+            </w:r>
+          </w:p>
+        </w:tc>
+        <w:tc>
+          <w:tcPr>
+            <w:tcW w:type="dxa" w:w="1134"/>
+            <w:tcBorders>
+              <w:top w:val="single" w:sz="4" w:color="CCCCCC"/>
+              <w:left w:val="single" w:sz="4" w:color="CCCCCC"/>
+              <w:bottom w:val="single" w:sz="4" w:color="CCCCCC"/>
+              <w:right w:val="single" w:sz="4" w:color="CCCCCC"/>
+            </w:tcBorders>
+            <w:shd w:val="clear" w:color="auto" w:fill="F5F0EA"/>
+            <w:vAlign w:val="center"/>
+          </w:tcPr>
+          <w:p>
+            <w:pPr>
+              <w:spacing w:before="40" w:after="40"/>
+            </w:pPr>
+            <w:r/>
+            <w:r>
+              <w:rPr>
+                <w:rFonts w:ascii="Calibri" w:hAnsi="Calibri"/>
+                <w:color w:val="1C1C1E"/>
+                <w:sz w:val="20"/>
+              </w:rPr>
+              <w:t>In progress</w:t>
+            </w:r>
+          </w:p>
+        </w:tc>
+        <w:tc>
+          <w:tcPr>
+            <w:tcW w:type="dxa" w:w="5046"/>
+            <w:tcBorders>
+              <w:top w:val="single" w:sz="4" w:color="CCCCCC"/>
+              <w:left w:val="single" w:sz="4" w:color="CCCCCC"/>
+              <w:bottom w:val="single" w:sz="4" w:color="CCCCCC"/>
+              <w:right w:val="single" w:sz="4" w:color="CCCCCC"/>
+            </w:tcBorders>
+            <w:shd w:val="clear" w:color="auto" w:fill="F5F0EA"/>
+            <w:vAlign w:val="center"/>
+          </w:tcPr>
+          <w:p>
+            <w:pPr>
+              <w:spacing w:before="40" w:after="40"/>
+            </w:pPr>
+            <w:r/>
+            <w:r>
+              <w:rPr>
+                <w:rFonts w:ascii="Calibri" w:hAnsi="Calibri"/>
+                <w:color w:val="1C1C1E"/>
+                <w:sz w:val="20"/>
+              </w:rPr>
+              <w:t>Cart APIs: GET /cart, POST /cart/item, PATCH /cart/item/{id}, DELETE /cart/item/{id}; auth/session helpers: logout, session forwarding, cookie parsing</w:t>
+            </w:r>
+          </w:p>
+        </w:tc>
+      </w:tr>
+      <w:tr>
+        <w:tc>
+          <w:tcPr>
+            <w:tcW w:type="dxa" w:w="1814"/>
+            <w:tcBorders>
+              <w:top w:val="single" w:sz="4" w:color="CCCCCC"/>
+              <w:left w:val="single" w:sz="4" w:color="CCCCCC"/>
+              <w:bottom w:val="single" w:sz="4" w:color="CCCCCC"/>
+              <w:right w:val="single" w:sz="4" w:color="CCCCCC"/>
+            </w:tcBorders>
+            <w:vAlign w:val="center"/>
+          </w:tcPr>
+          <w:p>
+            <w:pPr>
+              <w:spacing w:before="40" w:after="40"/>
+            </w:pPr>
+            <w:r/>
+            <w:r>
+              <w:rPr>
+                <w:rFonts w:ascii="Calibri" w:hAnsi="Calibri"/>
+                <w:color w:val="1C1C1E"/>
+                <w:sz w:val="20"/>
+              </w:rPr>
+              <w:t>Session &amp; Cookie Flow</w:t>
+            </w:r>
+          </w:p>
+        </w:tc>
+        <w:tc>
+          <w:tcPr>
+            <w:tcW w:type="dxa" w:w="1474"/>
+            <w:tcBorders>
+              <w:top w:val="single" w:sz="4" w:color="CCCCCC"/>
+              <w:left w:val="single" w:sz="4" w:color="CCCCCC"/>
+              <w:bottom w:val="single" w:sz="4" w:color="CCCCCC"/>
+              <w:right w:val="single" w:sz="4" w:color="CCCCCC"/>
+            </w:tcBorders>
+            <w:vAlign w:val="center"/>
+          </w:tcPr>
+          <w:p>
+            <w:pPr>
+              <w:spacing w:before="40" w:after="40"/>
+            </w:pPr>
+            <w:r/>
+            <w:r>
+              <w:rPr>
+                <w:rFonts w:ascii="Calibri" w:hAnsi="Calibri"/>
+                <w:color w:val="1C1C1E"/>
+                <w:sz w:val="20"/>
+              </w:rPr>
+              <w:t>Jun 2026</w:t>
+            </w:r>
+          </w:p>
+        </w:tc>
+        <w:tc>
+          <w:tcPr>
+            <w:tcW w:type="dxa" w:w="1134"/>
+            <w:tcBorders>
+              <w:top w:val="single" w:sz="4" w:color="CCCCCC"/>
+              <w:left w:val="single" w:sz="4" w:color="CCCCCC"/>
+              <w:bottom w:val="single" w:sz="4" w:color="CCCCCC"/>
+              <w:right w:val="single" w:sz="4" w:color="CCCCCC"/>
+            </w:tcBorders>
+            <w:vAlign w:val="center"/>
+          </w:tcPr>
+          <w:p>
+            <w:pPr>
+              <w:spacing w:before="40" w:after="40"/>
+            </w:pPr>
+            <w:r/>
+            <w:r>
+              <w:rPr>
+                <w:rFonts w:ascii="Calibri" w:hAnsi="Calibri"/>
+                <w:color w:val="1C1C1E"/>
+                <w:sz w:val="20"/>
+              </w:rPr>
+              <w:t>Not started</w:t>
+            </w:r>
+          </w:p>
+        </w:tc>
+        <w:tc>
+          <w:tcPr>
+            <w:tcW w:type="dxa" w:w="5046"/>
+            <w:tcBorders>
+              <w:top w:val="single" w:sz="4" w:color="CCCCCC"/>
+              <w:left w:val="single" w:sz="4" w:color="CCCCCC"/>
+              <w:bottom w:val="single" w:sz="4" w:color="CCCCCC"/>
+              <w:right w:val="single" w:sz="4" w:color="CCCCCC"/>
+            </w:tcBorders>
+            <w:vAlign w:val="center"/>
+          </w:tcPr>
+          <w:p>
+            <w:pPr>
+              <w:spacing w:before="40" w:after="40"/>
+            </w:pPr>
+            <w:r/>
+            <w:r>
+              <w:rPr>
+                <w:rFonts w:ascii="Calibri" w:hAnsi="Calibri"/>
+                <w:color w:val="1C1C1E"/>
+                <w:sz w:val="20"/>
+              </w:rPr>
+              <w:t>ZID session bootstrap, cookie persistence across WebView ↔ Flutter, token forwarding</w:t>
+            </w:r>
+          </w:p>
+        </w:tc>
+      </w:tr>
+      <w:tr>
+        <w:tc>
+          <w:tcPr>
+            <w:tcW w:type="dxa" w:w="1814"/>
+            <w:tcBorders>
+              <w:top w:val="single" w:sz="4" w:color="CCCCCC"/>
+              <w:left w:val="single" w:sz="4" w:color="CCCCCC"/>
+              <w:bottom w:val="single" w:sz="4" w:color="CCCCCC"/>
+              <w:right w:val="single" w:sz="4" w:color="CCCCCC"/>
+            </w:tcBorders>
+            <w:shd w:val="clear" w:color="auto" w:fill="F5F0EA"/>
+            <w:vAlign w:val="center"/>
+          </w:tcPr>
+          <w:p>
+            <w:pPr>
+              <w:spacing w:before="40" w:after="40"/>
+            </w:pPr>
+            <w:r/>
+            <w:r>
+              <w:rPr>
+                <w:rFonts w:ascii="Calibri" w:hAnsi="Calibri"/>
+                <w:color w:val="1C1C1E"/>
+                <w:sz w:val="20"/>
+              </w:rPr>
+              <w:t>Cart + Checkout Integration</w:t>
+            </w:r>
+          </w:p>
+        </w:tc>
+        <w:tc>
+          <w:tcPr>
+            <w:tcW w:type="dxa" w:w="1474"/>
+            <w:tcBorders>
+              <w:top w:val="single" w:sz="4" w:color="CCCCCC"/>
+              <w:left w:val="single" w:sz="4" w:color="CCCCCC"/>
+              <w:bottom w:val="single" w:sz="4" w:color="CCCCCC"/>
+              <w:right w:val="single" w:sz="4" w:color="CCCCCC"/>
+            </w:tcBorders>
+            <w:shd w:val="clear" w:color="auto" w:fill="F5F0EA"/>
+            <w:vAlign w:val="center"/>
+          </w:tcPr>
+          <w:p>
+            <w:pPr>
+              <w:spacing w:before="40" w:after="40"/>
+            </w:pPr>
+            <w:r/>
+            <w:r>
+              <w:rPr>
+                <w:rFonts w:ascii="Calibri" w:hAnsi="Calibri"/>
+                <w:color w:val="1C1C1E"/>
+                <w:sz w:val="20"/>
+              </w:rPr>
+              <w:t>11–15 Jun 2026</w:t>
+            </w:r>
+          </w:p>
+        </w:tc>
+        <w:tc>
+          <w:tcPr>
+            <w:tcW w:type="dxa" w:w="1134"/>
+            <w:tcBorders>
+              <w:top w:val="single" w:sz="4" w:color="CCCCCC"/>
+              <w:left w:val="single" w:sz="4" w:color="CCCCCC"/>
+              <w:bottom w:val="single" w:sz="4" w:color="CCCCCC"/>
+              <w:right w:val="single" w:sz="4" w:color="CCCCCC"/>
+            </w:tcBorders>
+            <w:shd w:val="clear" w:color="auto" w:fill="F5F0EA"/>
+            <w:vAlign w:val="center"/>
+          </w:tcPr>
+          <w:p>
+            <w:pPr>
+              <w:spacing w:before="40" w:after="40"/>
+            </w:pPr>
+            <w:r/>
+            <w:r>
+              <w:rPr>
+                <w:rFonts w:ascii="Calibri" w:hAnsi="Calibri"/>
+                <w:color w:val="1C1C1E"/>
+                <w:sz w:val="20"/>
+              </w:rPr>
+              <w:t>Not started</w:t>
+            </w:r>
+          </w:p>
+        </w:tc>
+        <w:tc>
+          <w:tcPr>
+            <w:tcW w:type="dxa" w:w="5046"/>
+            <w:tcBorders>
+              <w:top w:val="single" w:sz="4" w:color="CCCCCC"/>
+              <w:left w:val="single" w:sz="4" w:color="CCCCCC"/>
+              <w:bottom w:val="single" w:sz="4" w:color="CCCCCC"/>
+              <w:right w:val="single" w:sz="4" w:color="CCCCCC"/>
+            </w:tcBorders>
+            <w:shd w:val="clear" w:color="auto" w:fill="F5F0EA"/>
+            <w:vAlign w:val="center"/>
+          </w:tcPr>
+          <w:p>
+            <w:pPr>
+              <w:spacing w:before="40" w:after="40"/>
+            </w:pPr>
+            <w:r/>
+            <w:r>
+              <w:rPr>
+                <w:rFonts w:ascii="Calibri" w:hAnsi="Calibri"/>
+                <w:color w:val="1C1C1E"/>
+                <w:sz w:val="20"/>
+              </w:rPr>
+              <w:t>Bind Flutter cart to Laravel cart APIs; ZID checkout handoff</w:t>
+            </w:r>
+          </w:p>
+        </w:tc>
+      </w:tr>
+      <w:tr>
+        <w:tc>
+          <w:tcPr>
+            <w:tcW w:type="dxa" w:w="1814"/>
+            <w:tcBorders>
+              <w:top w:val="single" w:sz="4" w:color="CCCCCC"/>
+              <w:left w:val="single" w:sz="4" w:color="CCCCCC"/>
+              <w:bottom w:val="single" w:sz="4" w:color="CCCCCC"/>
+              <w:right w:val="single" w:sz="4" w:color="CCCCCC"/>
+            </w:tcBorders>
+            <w:vAlign w:val="center"/>
+          </w:tcPr>
+          <w:p>
+            <w:pPr>
+              <w:spacing w:before="40" w:after="40"/>
+            </w:pPr>
+            <w:r/>
+            <w:r>
+              <w:rPr>
+                <w:rFonts w:ascii="Calibri" w:hAnsi="Calibri"/>
+                <w:color w:val="1C1C1E"/>
+                <w:sz w:val="20"/>
+              </w:rPr>
+              <w:t>Purchase Success Flow</w:t>
+            </w:r>
+          </w:p>
+        </w:tc>
+        <w:tc>
+          <w:tcPr>
+            <w:tcW w:type="dxa" w:w="1474"/>
+            <w:tcBorders>
+              <w:top w:val="single" w:sz="4" w:color="CCCCCC"/>
+              <w:left w:val="single" w:sz="4" w:color="CCCCCC"/>
+              <w:bottom w:val="single" w:sz="4" w:color="CCCCCC"/>
+              <w:right w:val="single" w:sz="4" w:color="CCCCCC"/>
+            </w:tcBorders>
+            <w:vAlign w:val="center"/>
+          </w:tcPr>
+          <w:p>
+            <w:pPr>
+              <w:spacing w:before="40" w:after="40"/>
+            </w:pPr>
+            <w:r/>
+            <w:r>
+              <w:rPr>
+                <w:rFonts w:ascii="Calibri" w:hAnsi="Calibri"/>
+                <w:color w:val="1C1C1E"/>
+                <w:sz w:val="20"/>
+              </w:rPr>
+              <w:t>16–21 Jun 2026</w:t>
+            </w:r>
+          </w:p>
+        </w:tc>
+        <w:tc>
+          <w:tcPr>
+            <w:tcW w:type="dxa" w:w="1134"/>
+            <w:tcBorders>
+              <w:top w:val="single" w:sz="4" w:color="CCCCCC"/>
+              <w:left w:val="single" w:sz="4" w:color="CCCCCC"/>
+              <w:bottom w:val="single" w:sz="4" w:color="CCCCCC"/>
+              <w:right w:val="single" w:sz="4" w:color="CCCCCC"/>
+            </w:tcBorders>
+            <w:vAlign w:val="center"/>
+          </w:tcPr>
+          <w:p>
+            <w:pPr>
+              <w:spacing w:before="40" w:after="40"/>
+            </w:pPr>
+            <w:r/>
+            <w:r>
+              <w:rPr>
+                <w:rFonts w:ascii="Calibri" w:hAnsi="Calibri"/>
+                <w:color w:val="1C1C1E"/>
+                <w:sz w:val="20"/>
+              </w:rPr>
+              <w:t>Not started</w:t>
+            </w:r>
+          </w:p>
+        </w:tc>
+        <w:tc>
+          <w:tcPr>
+            <w:tcW w:type="dxa" w:w="5046"/>
+            <w:tcBorders>
+              <w:top w:val="single" w:sz="4" w:color="CCCCCC"/>
+              <w:left w:val="single" w:sz="4" w:color="CCCCCC"/>
+              <w:bottom w:val="single" w:sz="4" w:color="CCCCCC"/>
+              <w:right w:val="single" w:sz="4" w:color="CCCCCC"/>
+            </w:tcBorders>
+            <w:vAlign w:val="center"/>
+          </w:tcPr>
+          <w:p>
+            <w:pPr>
+              <w:spacing w:before="40" w:after="40"/>
+            </w:pPr>
+            <w:r/>
+            <w:r>
+              <w:rPr>
+                <w:rFonts w:ascii="Calibri" w:hAnsi="Calibri"/>
+                <w:color w:val="1C1C1E"/>
+                <w:sz w:val="20"/>
+              </w:rPr>
+              <w:t>Order confirmation, success callbacks, post-purchase state sync</w:t>
+            </w:r>
+          </w:p>
+        </w:tc>
+      </w:tr>
+      <w:tr>
+        <w:tc>
+          <w:tcPr>
+            <w:tcW w:type="dxa" w:w="1814"/>
+            <w:tcBorders>
+              <w:top w:val="single" w:sz="4" w:color="CCCCCC"/>
+              <w:left w:val="single" w:sz="4" w:color="CCCCCC"/>
+              <w:bottom w:val="single" w:sz="4" w:color="CCCCCC"/>
+              <w:right w:val="single" w:sz="4" w:color="CCCCCC"/>
+            </w:tcBorders>
+            <w:shd w:val="clear" w:color="auto" w:fill="F5F0EA"/>
+            <w:vAlign w:val="center"/>
+          </w:tcPr>
+          <w:p>
+            <w:pPr>
+              <w:spacing w:before="40" w:after="40"/>
+            </w:pPr>
+            <w:r/>
+            <w:r>
+              <w:rPr>
+                <w:rFonts w:ascii="Calibri" w:hAnsi="Calibri"/>
+                <w:color w:val="1C1C1E"/>
+                <w:sz w:val="20"/>
+              </w:rPr>
+              <w:t>Tracking &amp; Analytics</w:t>
+            </w:r>
+          </w:p>
+        </w:tc>
+        <w:tc>
+          <w:tcPr>
+            <w:tcW w:type="dxa" w:w="1474"/>
+            <w:tcBorders>
+              <w:top w:val="single" w:sz="4" w:color="CCCCCC"/>
+              <w:left w:val="single" w:sz="4" w:color="CCCCCC"/>
+              <w:bottom w:val="single" w:sz="4" w:color="CCCCCC"/>
+              <w:right w:val="single" w:sz="4" w:color="CCCCCC"/>
+            </w:tcBorders>
+            <w:shd w:val="clear" w:color="auto" w:fill="F5F0EA"/>
+            <w:vAlign w:val="center"/>
+          </w:tcPr>
+          <w:p>
+            <w:pPr>
+              <w:spacing w:before="40" w:after="40"/>
+            </w:pPr>
+            <w:r/>
+            <w:r>
+              <w:rPr>
+                <w:rFonts w:ascii="Calibri" w:hAnsi="Calibri"/>
+                <w:color w:val="1C1C1E"/>
+                <w:sz w:val="20"/>
+              </w:rPr>
+              <w:t>21 Jun–1 Jul 2026</w:t>
+            </w:r>
+          </w:p>
+        </w:tc>
+        <w:tc>
+          <w:tcPr>
+            <w:tcW w:type="dxa" w:w="1134"/>
+            <w:tcBorders>
+              <w:top w:val="single" w:sz="4" w:color="CCCCCC"/>
+              <w:left w:val="single" w:sz="4" w:color="CCCCCC"/>
+              <w:bottom w:val="single" w:sz="4" w:color="CCCCCC"/>
+              <w:right w:val="single" w:sz="4" w:color="CCCCCC"/>
+            </w:tcBorders>
+            <w:shd w:val="clear" w:color="auto" w:fill="F5F0EA"/>
+            <w:vAlign w:val="center"/>
+          </w:tcPr>
+          <w:p>
+            <w:pPr>
+              <w:spacing w:before="40" w:after="40"/>
+            </w:pPr>
+            <w:r/>
+            <w:r>
+              <w:rPr>
+                <w:rFonts w:ascii="Calibri" w:hAnsi="Calibri"/>
+                <w:color w:val="1C1C1E"/>
+                <w:sz w:val="20"/>
+              </w:rPr>
+              <w:t>Not started</w:t>
+            </w:r>
+          </w:p>
+        </w:tc>
+        <w:tc>
+          <w:tcPr>
+            <w:tcW w:type="dxa" w:w="5046"/>
+            <w:tcBorders>
+              <w:top w:val="single" w:sz="4" w:color="CCCCCC"/>
+              <w:left w:val="single" w:sz="4" w:color="CCCCCC"/>
+              <w:bottom w:val="single" w:sz="4" w:color="CCCCCC"/>
+              <w:right w:val="single" w:sz="4" w:color="CCCCCC"/>
+            </w:tcBorders>
+            <w:shd w:val="clear" w:color="auto" w:fill="F5F0EA"/>
+            <w:vAlign w:val="center"/>
+          </w:tcPr>
+          <w:p>
+            <w:pPr>
+              <w:spacing w:before="40" w:after="40"/>
+            </w:pPr>
+            <w:r/>
+            <w:r>
+              <w:rPr>
+                <w:rFonts w:ascii="Calibri" w:hAnsi="Calibri"/>
+                <w:color w:val="1C1C1E"/>
+                <w:sz w:val="20"/>
+              </w:rPr>
+              <w:t>Analytics scripts, event tracking, conversion funnels</w:t>
+            </w:r>
+          </w:p>
+        </w:tc>
+      </w:tr>
+      <w:tr>
+        <w:tc>
+          <w:tcPr>
+            <w:tcW w:type="dxa" w:w="1814"/>
+            <w:tcBorders>
+              <w:top w:val="single" w:sz="4" w:color="CCCCCC"/>
+              <w:left w:val="single" w:sz="4" w:color="CCCCCC"/>
+              <w:bottom w:val="single" w:sz="4" w:color="CCCCCC"/>
+              <w:right w:val="single" w:sz="4" w:color="CCCCCC"/>
+            </w:tcBorders>
+            <w:vAlign w:val="center"/>
+          </w:tcPr>
+          <w:p>
+            <w:pPr>
+              <w:spacing w:before="40" w:after="40"/>
+            </w:pPr>
+            <w:r/>
+            <w:r>
+              <w:rPr>
+                <w:rFonts w:ascii="Calibri" w:hAnsi="Calibri"/>
+                <w:color w:val="1C1C1E"/>
+                <w:sz w:val="20"/>
+              </w:rPr>
+              <w:t>Test &amp; QA</w:t>
+            </w:r>
+          </w:p>
+        </w:tc>
+        <w:tc>
+          <w:tcPr>
+            <w:tcW w:type="dxa" w:w="1474"/>
+            <w:tcBorders>
+              <w:top w:val="single" w:sz="4" w:color="CCCCCC"/>
+              <w:left w:val="single" w:sz="4" w:color="CCCCCC"/>
+              <w:bottom w:val="single" w:sz="4" w:color="CCCCCC"/>
+              <w:right w:val="single" w:sz="4" w:color="CCCCCC"/>
+            </w:tcBorders>
+            <w:vAlign w:val="center"/>
+          </w:tcPr>
+          <w:p>
+            <w:pPr>
+              <w:spacing w:before="40" w:after="40"/>
+            </w:pPr>
+            <w:r/>
+            <w:r>
+              <w:rPr>
+                <w:rFonts w:ascii="Calibri" w:hAnsi="Calibri"/>
+                <w:color w:val="1C1C1E"/>
+                <w:sz w:val="20"/>
+              </w:rPr>
+              <w:t>4–5 Jul 2026</w:t>
+            </w:r>
+          </w:p>
+        </w:tc>
+        <w:tc>
+          <w:tcPr>
+            <w:tcW w:type="dxa" w:w="1134"/>
+            <w:tcBorders>
+              <w:top w:val="single" w:sz="4" w:color="CCCCCC"/>
+              <w:left w:val="single" w:sz="4" w:color="CCCCCC"/>
+              <w:bottom w:val="single" w:sz="4" w:color="CCCCCC"/>
+              <w:right w:val="single" w:sz="4" w:color="CCCCCC"/>
+            </w:tcBorders>
+            <w:vAlign w:val="center"/>
+          </w:tcPr>
+          <w:p>
+            <w:pPr>
+              <w:spacing w:before="40" w:after="40"/>
+            </w:pPr>
+            <w:r/>
+            <w:r>
+              <w:rPr>
+                <w:rFonts w:ascii="Calibri" w:hAnsi="Calibri"/>
+                <w:color w:val="1C1C1E"/>
+                <w:sz w:val="20"/>
+              </w:rPr>
+              <w:t>Not started</w:t>
+            </w:r>
+          </w:p>
+        </w:tc>
+        <w:tc>
+          <w:tcPr>
+            <w:tcW w:type="dxa" w:w="5046"/>
+            <w:tcBorders>
+              <w:top w:val="single" w:sz="4" w:color="CCCCCC"/>
+              <w:left w:val="single" w:sz="4" w:color="CCCCCC"/>
+              <w:bottom w:val="single" w:sz="4" w:color="CCCCCC"/>
+              <w:right w:val="single" w:sz="4" w:color="CCCCCC"/>
+            </w:tcBorders>
+            <w:vAlign w:val="center"/>
+          </w:tcPr>
+          <w:p>
+            <w:pPr>
+              <w:spacing w:before="40" w:after="40"/>
+            </w:pPr>
+            <w:r/>
+            <w:r>
+              <w:rPr>
+                <w:rFonts w:ascii="Calibri" w:hAnsi="Calibri"/>
+                <w:color w:val="1C1C1E"/>
+                <w:sz w:val="20"/>
+              </w:rPr>
+              <w:t>Cart + checkout + session regression across iOS + Android</w:t>
+            </w:r>
+          </w:p>
+        </w:tc>
+      </w:tr>
+      <w:tr>
+        <w:tc>
+          <w:tcPr>
+            <w:tcW w:type="dxa" w:w="1814"/>
+            <w:tcBorders>
+              <w:top w:val="single" w:sz="4" w:color="CCCCCC"/>
+              <w:left w:val="single" w:sz="4" w:color="CCCCCC"/>
+              <w:bottom w:val="single" w:sz="4" w:color="CCCCCC"/>
+              <w:right w:val="single" w:sz="4" w:color="CCCCCC"/>
+            </w:tcBorders>
+            <w:shd w:val="clear" w:color="auto" w:fill="F5F0EA"/>
+            <w:vAlign w:val="center"/>
+          </w:tcPr>
+          <w:p>
+            <w:pPr>
+              <w:spacing w:before="40" w:after="40"/>
+            </w:pPr>
+            <w:r/>
+            <w:r>
+              <w:rPr>
+                <w:rFonts w:ascii="Calibri" w:hAnsi="Calibri"/>
+                <w:color w:val="1C1C1E"/>
+                <w:sz w:val="20"/>
+              </w:rPr>
+              <w:t>Production Readiness</w:t>
+            </w:r>
+          </w:p>
+        </w:tc>
+        <w:tc>
+          <w:tcPr>
+            <w:tcW w:type="dxa" w:w="1474"/>
+            <w:tcBorders>
+              <w:top w:val="single" w:sz="4" w:color="CCCCCC"/>
+              <w:left w:val="single" w:sz="4" w:color="CCCCCC"/>
+              <w:bottom w:val="single" w:sz="4" w:color="CCCCCC"/>
+              <w:right w:val="single" w:sz="4" w:color="CCCCCC"/>
+            </w:tcBorders>
+            <w:shd w:val="clear" w:color="auto" w:fill="F5F0EA"/>
+            <w:vAlign w:val="center"/>
+          </w:tcPr>
+          <w:p>
+            <w:pPr>
+              <w:spacing w:before="40" w:after="40"/>
+            </w:pPr>
+            <w:r/>
+            <w:r>
+              <w:rPr>
+                <w:rFonts w:ascii="Calibri" w:hAnsi="Calibri"/>
+                <w:color w:val="1C1C1E"/>
+                <w:sz w:val="20"/>
+              </w:rPr>
+              <w:t>6–11 Jul 2026</w:t>
+            </w:r>
+          </w:p>
+        </w:tc>
+        <w:tc>
+          <w:tcPr>
+            <w:tcW w:type="dxa" w:w="1134"/>
+            <w:tcBorders>
+              <w:top w:val="single" w:sz="4" w:color="CCCCCC"/>
+              <w:left w:val="single" w:sz="4" w:color="CCCCCC"/>
+              <w:bottom w:val="single" w:sz="4" w:color="CCCCCC"/>
+              <w:right w:val="single" w:sz="4" w:color="CCCCCC"/>
+            </w:tcBorders>
+            <w:shd w:val="clear" w:color="auto" w:fill="F5F0EA"/>
+            <w:vAlign w:val="center"/>
+          </w:tcPr>
+          <w:p>
+            <w:pPr>
+              <w:spacing w:before="40" w:after="40"/>
+            </w:pPr>
+            <w:r/>
+            <w:r>
+              <w:rPr>
+                <w:rFonts w:ascii="Calibri" w:hAnsi="Calibri"/>
+                <w:color w:val="1C1C1E"/>
+                <w:sz w:val="20"/>
+              </w:rPr>
+              <w:t>Not started</w:t>
+            </w:r>
+          </w:p>
+        </w:tc>
+        <w:tc>
+          <w:tcPr>
+            <w:tcW w:type="dxa" w:w="5046"/>
+            <w:tcBorders>
+              <w:top w:val="single" w:sz="4" w:color="CCCCCC"/>
+              <w:left w:val="single" w:sz="4" w:color="CCCCCC"/>
+              <w:bottom w:val="single" w:sz="4" w:color="CCCCCC"/>
+              <w:right w:val="single" w:sz="4" w:color="CCCCCC"/>
+            </w:tcBorders>
+            <w:shd w:val="clear" w:color="auto" w:fill="F5F0EA"/>
+            <w:vAlign w:val="center"/>
+          </w:tcPr>
+          <w:p>
+            <w:pPr>
+              <w:spacing w:before="40" w:after="40"/>
+            </w:pPr>
+            <w:r/>
+            <w:r>
+              <w:rPr>
+                <w:rFonts w:ascii="Calibri" w:hAnsi="Calibri"/>
+                <w:color w:val="1C1C1E"/>
+                <w:sz w:val="20"/>
+              </w:rPr>
+              <w:t>Deep linking, push notifications, error monitoring, loading states, analytics verification, app-store testing</w:t>
+            </w:r>
+          </w:p>
+        </w:tc>
+      </w:tr>
+    </w:tbl>
+    <w:p>
       <w:r>
         <w:br w:type="page"/>
       </w:r>
@@ -3121,7 +4207,7 @@
                 <w:color w:val="1C1C1E"/>
                 <w:sz w:val="20"/>
               </w:rPr>
-              <w:t>React Native or native iOS + Android</w:t>
+              <w:t>Flutter (Dart), single codebase iOS + Android</w:t>
             </w:r>
           </w:p>
         </w:tc>
@@ -3253,7 +4339,7 @@
                 <w:color w:val="1C1C1E"/>
                 <w:sz w:val="20"/>
               </w:rPr>
-              <w:t>Node.js/NestJS or Go, microservice-friendly</w:t>
+              <w:t>Laravel (PHP), ZID integration</w:t>
             </w:r>
           </w:p>
         </w:tc>
@@ -8806,7 +9892,7 @@
                 <w:color w:val="1C1C1E"/>
                 <w:sz w:val="20"/>
               </w:rPr>
-              <w:t>Mobile Apps (iOS + Android)</w:t>
+              <w:t>Mobile App (Flutter)</w:t>
             </w:r>
           </w:p>
         </w:tc>
@@ -8832,7 +9918,7 @@
                 <w:color w:val="1C1C1E"/>
                 <w:sz w:val="20"/>
               </w:rPr>
-              <w:t>RN-shared, deep-linking, biometrics, push, offline cart.</w:t>
+              <w:t>Single Dart codebase iOS + Android, ZID WebView bridge, deep-linking, biometrics, push, offline cart.</w:t>
             </w:r>
           </w:p>
         </w:tc>
@@ -8936,7 +10022,7 @@
                 <w:color w:val="1C1C1E"/>
                 <w:sz w:val="20"/>
               </w:rPr>
-              <w:t>2 Mobile</w:t>
+              <w:t>2 Flutter</w:t>
             </w:r>
           </w:p>
         </w:tc>
@@ -9589,7 +10675,17 @@
         <w:ind w:left="283"/>
       </w:pPr>
       <w:r>
-        <w:t>Mobile app (React Native with native modules).</w:t>
+        <w:t>Mobile app (Flutter — single Dart codebase; native modules for biometrics + payments).</w:t>
+      </w:r>
+    </w:p>
+    <w:p>
+      <w:pPr>
+        <w:pStyle w:val="ListBullet"/>
+        <w:spacing w:after="40"/>
+        <w:ind w:left="283"/>
+      </w:pPr>
+      <w:r>
+        <w:t>ZID WebView bridge + session/cookie forwarding between Flutter client and Laravel.</w:t>
       </w:r>
     </w:p>
     <w:p>
@@ -10010,7 +11106,7 @@
                 <w:color w:val="1C1C1E"/>
                 <w:sz w:val="20"/>
               </w:rPr>
-              <w:t>Frontend (Web)</w:t>
+              <w:t>Mobile (Primary)</w:t>
             </w:r>
           </w:p>
         </w:tc>
@@ -10036,7 +11132,7 @@
                 <w:color w:val="1C1C1E"/>
                 <w:sz w:val="20"/>
               </w:rPr>
-              <w:t>Next.js 14 (App Router) + TypeScript + Tailwind v4 + Framer Motion</w:t>
+              <w:t>Flutter (Dart) — single codebase for iOS + Android</w:t>
             </w:r>
           </w:p>
         </w:tc>
@@ -10062,7 +11158,7 @@
                 <w:color w:val="1C1C1E"/>
                 <w:sz w:val="20"/>
               </w:rPr>
-              <w:t>SSR/ISR for SEO, mature i18n + RTL</w:t>
+              <w:t>One team, native performance, fast iteration</w:t>
             </w:r>
           </w:p>
         </w:tc>
@@ -10091,7 +11187,7 @@
                 <w:color w:val="1C1C1E"/>
                 <w:sz w:val="20"/>
               </w:rPr>
-              <w:t>Mobile</w:t>
+              <w:t>Web</w:t>
             </w:r>
           </w:p>
         </w:tc>
@@ -10118,7 +11214,7 @@
                 <w:color w:val="1C1C1E"/>
                 <w:sz w:val="20"/>
               </w:rPr>
-              <w:t>React Native (Expo bare), native modules for biometrics/Apple Pay</w:t>
+              <w:t>Next.js 14 (App Router) + TypeScript + Tailwind v4 + Framer Motion</w:t>
             </w:r>
           </w:p>
         </w:tc>
@@ -10145,7 +11241,7 @@
                 <w:color w:val="1C1C1E"/>
                 <w:sz w:val="20"/>
               </w:rPr>
-              <w:t>Single team, ~80% code reuse</w:t>
+              <w:t>SSR/ISR for SEO, mature i18n + RTL</w:t>
             </w:r>
           </w:p>
         </w:tc>
@@ -10199,7 +11295,7 @@
                 <w:color w:val="1C1C1E"/>
                 <w:sz w:val="20"/>
               </w:rPr>
-              <w:t>Node.js (NestJS, TS) microservices; Go for hot paths</w:t>
+              <w:t>Laravel (PHP 8.3) — REST APIs, queues, scheduler</w:t>
             </w:r>
           </w:p>
         </w:tc>
@@ -10225,7 +11321,7 @@
                 <w:color w:val="1C1C1E"/>
                 <w:sz w:val="20"/>
               </w:rPr>
-              <w:t>Type-safe full stack, large hiring pool</w:t>
+              <w:t>Owns session/cookie, ZID integration, business logic</w:t>
             </w:r>
           </w:p>
         </w:tc>
@@ -10254,7 +11350,7 @@
                 <w:color w:val="1C1C1E"/>
                 <w:sz w:val="20"/>
               </w:rPr>
-              <w:t>API Gateway / BFF</w:t>
+              <w:t>Commerce Platform</w:t>
             </w:r>
           </w:p>
         </w:tc>
@@ -10281,7 +11377,7 @@
                 <w:color w:val="1C1C1E"/>
                 <w:sz w:val="20"/>
               </w:rPr>
-              <w:t>AWS API Gateway + GraphQL BFF or REST + tRPC</w:t>
+              <w:t>ZID — headless storefront + WebView</w:t>
             </w:r>
           </w:p>
         </w:tc>
@@ -10308,7 +11404,7 @@
                 <w:color w:val="1C1C1E"/>
                 <w:sz w:val="20"/>
               </w:rPr>
-              <w:t>Tailors payloads per channel</w:t>
+              <w:t>GCC-native catalog, orders, payments; compresses commerce build</w:t>
             </w:r>
           </w:p>
         </w:tc>
@@ -10336,7 +11432,7 @@
                 <w:color w:val="1C1C1E"/>
                 <w:sz w:val="20"/>
               </w:rPr>
-              <w:t>Database</w:t>
+              <w:t>Session / Cookie Bridge</w:t>
             </w:r>
           </w:p>
         </w:tc>
@@ -10362,7 +11458,7 @@
                 <w:color w:val="1C1C1E"/>
                 <w:sz w:val="20"/>
               </w:rPr>
-              <w:t>PostgreSQL 16 on Amazon RDS (multi-AZ). pgvector for embeddings.</w:t>
+              <w:t>Laravel session forwarding + cookie parsing</w:t>
             </w:r>
           </w:p>
         </w:tc>
@@ -10388,7 +11484,7 @@
                 <w:color w:val="1C1C1E"/>
                 <w:sz w:val="20"/>
               </w:rPr>
-              <w:t>ACID for orders, JSON for attributes</w:t>
+              <w:t>Seamless auth across ZID WebView ↔ Flutter client</w:t>
             </w:r>
           </w:p>
         </w:tc>
@@ -10417,7 +11513,7 @@
                 <w:color w:val="1C1C1E"/>
                 <w:sz w:val="20"/>
               </w:rPr>
-              <w:t>Caching</w:t>
+              <w:t>API Gateway / BFF</w:t>
             </w:r>
           </w:p>
         </w:tc>
@@ -10444,7 +11540,7 @@
                 <w:color w:val="1C1C1E"/>
                 <w:sz w:val="20"/>
               </w:rPr>
-              <w:t>Redis (ElastiCache)</w:t>
+              <w:t>AWS API Gateway + REST; GraphQL BFF optional</w:t>
             </w:r>
           </w:p>
         </w:tc>
@@ -10471,7 +11567,7 @@
                 <w:color w:val="1C1C1E"/>
                 <w:sz w:val="20"/>
               </w:rPr>
-              <w:t>Sub-ms latency, sessions/cart/rate-limit</w:t>
+              <w:t>Tailors payloads per channel</w:t>
             </w:r>
           </w:p>
         </w:tc>
@@ -10499,7 +11595,7 @@
                 <w:color w:val="1C1C1E"/>
                 <w:sz w:val="20"/>
               </w:rPr>
-              <w:t>Search</w:t>
+              <w:t>Database</w:t>
             </w:r>
           </w:p>
         </w:tc>
@@ -10525,7 +11621,7 @@
                 <w:color w:val="1C1C1E"/>
                 <w:sz w:val="20"/>
               </w:rPr>
-              <w:t>OpenSearch with Arabic + English ICU analyzers</w:t>
+              <w:t>PostgreSQL 16 on Amazon RDS (multi-AZ). pgvector for embeddings.</w:t>
             </w:r>
           </w:p>
         </w:tc>
@@ -10551,7 +11647,7 @@
                 <w:color w:val="1C1C1E"/>
                 <w:sz w:val="20"/>
               </w:rPr>
-              <w:t>Faceted search, typo tolerance, RTL</w:t>
+              <w:t>ACID for orders, JSON for attributes</w:t>
             </w:r>
           </w:p>
         </w:tc>
@@ -10580,7 +11676,7 @@
                 <w:color w:val="1C1C1E"/>
                 <w:sz w:val="20"/>
               </w:rPr>
-              <w:t>Queue / Events</w:t>
+              <w:t>Caching</w:t>
             </w:r>
           </w:p>
         </w:tc>
@@ -10607,7 +11703,7 @@
                 <w:color w:val="1C1C1E"/>
                 <w:sz w:val="20"/>
               </w:rPr>
-              <w:t>Amazon SQS + EventBridge (Kafka optional in V2)</w:t>
+              <w:t>Redis (ElastiCache)</w:t>
             </w:r>
           </w:p>
         </w:tc>
@@ -10634,7 +11730,7 @@
                 <w:color w:val="1C1C1E"/>
                 <w:sz w:val="20"/>
               </w:rPr>
-              <w:t>Decouples checkout, notifications, payouts</w:t>
+              <w:t>Sub-ms latency, sessions/cart/rate-limit</w:t>
             </w:r>
           </w:p>
         </w:tc>
@@ -10662,7 +11758,7 @@
                 <w:color w:val="1C1C1E"/>
                 <w:sz w:val="20"/>
               </w:rPr>
-              <w:t>Object Storage</w:t>
+              <w:t>Search</w:t>
             </w:r>
           </w:p>
         </w:tc>
@@ -10688,7 +11784,7 @@
                 <w:color w:val="1C1C1E"/>
                 <w:sz w:val="20"/>
               </w:rPr>
-              <w:t>Amazon S3 + CloudFront CDN</w:t>
+              <w:t>OpenSearch with Arabic + English ICU analyzers</w:t>
             </w:r>
           </w:p>
         </w:tc>
@@ -10714,7 +11810,7 @@
                 <w:color w:val="1C1C1E"/>
                 <w:sz w:val="20"/>
               </w:rPr>
-              <w:t>Images, KYC, gift card art, signed URLs</w:t>
+              <w:t>Faceted search, typo tolerance, RTL</w:t>
             </w:r>
           </w:p>
         </w:tc>
@@ -10743,7 +11839,7 @@
                 <w:color w:val="1C1C1E"/>
                 <w:sz w:val="20"/>
               </w:rPr>
-              <w:t>Cloud Region</w:t>
+              <w:t>Queue / Events</w:t>
             </w:r>
           </w:p>
         </w:tc>
@@ -10770,7 +11866,7 @@
                 <w:color w:val="1C1C1E"/>
                 <w:sz w:val="20"/>
               </w:rPr>
-              <w:t>AWS me-central-1 (UAE) primary, eu-south-1 DR</w:t>
+              <w:t>Amazon SQS + EventBridge (Kafka optional in V2)</w:t>
             </w:r>
           </w:p>
         </w:tc>
@@ -10797,7 +11893,7 @@
                 <w:color w:val="1C1C1E"/>
                 <w:sz w:val="20"/>
               </w:rPr>
-              <w:t>Data residency for PDPL, low latency</w:t>
+              <w:t>Decouples checkout, notifications, payouts</w:t>
             </w:r>
           </w:p>
         </w:tc>
@@ -10825,7 +11921,7 @@
                 <w:color w:val="1C1C1E"/>
                 <w:sz w:val="20"/>
               </w:rPr>
-              <w:t>CDN &amp; Edge</w:t>
+              <w:t>Object Storage</w:t>
             </w:r>
           </w:p>
         </w:tc>
@@ -10851,7 +11947,7 @@
                 <w:color w:val="1C1C1E"/>
                 <w:sz w:val="20"/>
               </w:rPr>
-              <w:t>CloudFront + Lambda@Edge</w:t>
+              <w:t>Amazon S3 + CloudFront CDN</w:t>
             </w:r>
           </w:p>
         </w:tc>
@@ -10877,7 +11973,7 @@
                 <w:color w:val="1C1C1E"/>
                 <w:sz w:val="20"/>
               </w:rPr>
-              <w:t>Image optimization, Arabic font subsetting</w:t>
+              <w:t>Images, KYC, gift card art, signed URLs</w:t>
             </w:r>
           </w:p>
         </w:tc>
@@ -10906,7 +12002,7 @@
                 <w:color w:val="1C1C1E"/>
                 <w:sz w:val="20"/>
               </w:rPr>
-              <w:t>Identity</w:t>
+              <w:t>Cloud Region</w:t>
             </w:r>
           </w:p>
         </w:tc>
@@ -10933,7 +12029,7 @@
                 <w:color w:val="1C1C1E"/>
                 <w:sz w:val="20"/>
               </w:rPr>
-              <w:t>AWS Cognito or Auth0; WhatsApp Business OTP</w:t>
+              <w:t>AWS me-central-1 (UAE) primary, eu-south-1 DR</w:t>
             </w:r>
           </w:p>
         </w:tc>
@@ -10960,7 +12056,7 @@
                 <w:color w:val="1C1C1E"/>
                 <w:sz w:val="20"/>
               </w:rPr>
-              <w:t>Offload undifferentiated auth</w:t>
+              <w:t>Data residency for PDPL, low latency</w:t>
             </w:r>
           </w:p>
         </w:tc>
@@ -10988,7 +12084,7 @@
                 <w:color w:val="1C1C1E"/>
                 <w:sz w:val="20"/>
               </w:rPr>
-              <w:t>Payments</w:t>
+              <w:t>CDN &amp; Edge</w:t>
             </w:r>
           </w:p>
         </w:tc>
@@ -11014,7 +12110,7 @@
                 <w:color w:val="1C1C1E"/>
                 <w:sz w:val="20"/>
               </w:rPr>
-              <w:t>Thawani (OMR), Tap, Apple Pay, COD</w:t>
+              <w:t>CloudFront + Lambda@Edge</w:t>
             </w:r>
           </w:p>
         </w:tc>
@@ -11040,7 +12136,7 @@
                 <w:color w:val="1C1C1E"/>
                 <w:sz w:val="20"/>
               </w:rPr>
-              <w:t>Local rails first, expand later</w:t>
+              <w:t>Image optimization, Arabic font subsetting</w:t>
             </w:r>
           </w:p>
         </w:tc>
@@ -11069,7 +12165,7 @@
                 <w:color w:val="1C1C1E"/>
                 <w:sz w:val="20"/>
               </w:rPr>
-              <w:t>Observability</w:t>
+              <w:t>Identity</w:t>
             </w:r>
           </w:p>
         </w:tc>
@@ -11096,7 +12192,7 @@
                 <w:color w:val="1C1C1E"/>
                 <w:sz w:val="20"/>
               </w:rPr>
-              <w:t>Datadog (APM + logs + RUM) or Grafana Cloud</w:t>
+              <w:t>AWS Cognito or Auth0; WhatsApp Business OTP</w:t>
             </w:r>
           </w:p>
         </w:tc>
@@ -11123,7 +12219,7 @@
                 <w:color w:val="1C1C1E"/>
                 <w:sz w:val="20"/>
               </w:rPr>
-              <w:t>Full-stack visibility</w:t>
+              <w:t>Offload undifferentiated auth</w:t>
             </w:r>
           </w:p>
         </w:tc>
@@ -11151,6 +12247,169 @@
                 <w:color w:val="1C1C1E"/>
                 <w:sz w:val="20"/>
               </w:rPr>
+              <w:t>Payments</w:t>
+            </w:r>
+          </w:p>
+        </w:tc>
+        <w:tc>
+          <w:tcPr>
+            <w:tcW w:type="dxa" w:w="3798"/>
+            <w:tcBorders>
+              <w:top w:val="single" w:sz="4" w:color="CCCCCC"/>
+              <w:left w:val="single" w:sz="4" w:color="CCCCCC"/>
+              <w:bottom w:val="single" w:sz="4" w:color="CCCCCC"/>
+              <w:right w:val="single" w:sz="4" w:color="CCCCCC"/>
+            </w:tcBorders>
+            <w:vAlign w:val="center"/>
+          </w:tcPr>
+          <w:p>
+            <w:pPr>
+              <w:spacing w:before="40" w:after="40"/>
+            </w:pPr>
+            <w:r/>
+            <w:r>
+              <w:rPr>
+                <w:rFonts w:ascii="Calibri" w:hAnsi="Calibri"/>
+                <w:color w:val="1C1C1E"/>
+                <w:sz w:val="20"/>
+              </w:rPr>
+              <w:t>Thawani (OMR), Tap, Apple Pay, COD</w:t>
+            </w:r>
+          </w:p>
+        </w:tc>
+        <w:tc>
+          <w:tcPr>
+            <w:tcW w:type="dxa" w:w="3118"/>
+            <w:tcBorders>
+              <w:top w:val="single" w:sz="4" w:color="CCCCCC"/>
+              <w:left w:val="single" w:sz="4" w:color="CCCCCC"/>
+              <w:bottom w:val="single" w:sz="4" w:color="CCCCCC"/>
+              <w:right w:val="single" w:sz="4" w:color="CCCCCC"/>
+            </w:tcBorders>
+            <w:vAlign w:val="center"/>
+          </w:tcPr>
+          <w:p>
+            <w:pPr>
+              <w:spacing w:before="40" w:after="40"/>
+            </w:pPr>
+            <w:r/>
+            <w:r>
+              <w:rPr>
+                <w:rFonts w:ascii="Calibri" w:hAnsi="Calibri"/>
+                <w:color w:val="1C1C1E"/>
+                <w:sz w:val="20"/>
+              </w:rPr>
+              <w:t>Local rails first, expand later</w:t>
+            </w:r>
+          </w:p>
+        </w:tc>
+      </w:tr>
+      <w:tr>
+        <w:tc>
+          <w:tcPr>
+            <w:tcW w:type="dxa" w:w="1984"/>
+            <w:tcBorders>
+              <w:top w:val="single" w:sz="4" w:color="CCCCCC"/>
+              <w:left w:val="single" w:sz="4" w:color="CCCCCC"/>
+              <w:bottom w:val="single" w:sz="4" w:color="CCCCCC"/>
+              <w:right w:val="single" w:sz="4" w:color="CCCCCC"/>
+            </w:tcBorders>
+            <w:shd w:val="clear" w:color="auto" w:fill="F5F0EA"/>
+            <w:vAlign w:val="center"/>
+          </w:tcPr>
+          <w:p>
+            <w:pPr>
+              <w:spacing w:before="40" w:after="40"/>
+            </w:pPr>
+            <w:r/>
+            <w:r>
+              <w:rPr>
+                <w:rFonts w:ascii="Calibri" w:hAnsi="Calibri"/>
+                <w:color w:val="1C1C1E"/>
+                <w:sz w:val="20"/>
+              </w:rPr>
+              <w:t>Observability</w:t>
+            </w:r>
+          </w:p>
+        </w:tc>
+        <w:tc>
+          <w:tcPr>
+            <w:tcW w:type="dxa" w:w="3798"/>
+            <w:tcBorders>
+              <w:top w:val="single" w:sz="4" w:color="CCCCCC"/>
+              <w:left w:val="single" w:sz="4" w:color="CCCCCC"/>
+              <w:bottom w:val="single" w:sz="4" w:color="CCCCCC"/>
+              <w:right w:val="single" w:sz="4" w:color="CCCCCC"/>
+            </w:tcBorders>
+            <w:shd w:val="clear" w:color="auto" w:fill="F5F0EA"/>
+            <w:vAlign w:val="center"/>
+          </w:tcPr>
+          <w:p>
+            <w:pPr>
+              <w:spacing w:before="40" w:after="40"/>
+            </w:pPr>
+            <w:r/>
+            <w:r>
+              <w:rPr>
+                <w:rFonts w:ascii="Calibri" w:hAnsi="Calibri"/>
+                <w:color w:val="1C1C1E"/>
+                <w:sz w:val="20"/>
+              </w:rPr>
+              <w:t>Datadog (APM + logs + RUM) or Grafana Cloud</w:t>
+            </w:r>
+          </w:p>
+        </w:tc>
+        <w:tc>
+          <w:tcPr>
+            <w:tcW w:type="dxa" w:w="3118"/>
+            <w:tcBorders>
+              <w:top w:val="single" w:sz="4" w:color="CCCCCC"/>
+              <w:left w:val="single" w:sz="4" w:color="CCCCCC"/>
+              <w:bottom w:val="single" w:sz="4" w:color="CCCCCC"/>
+              <w:right w:val="single" w:sz="4" w:color="CCCCCC"/>
+            </w:tcBorders>
+            <w:shd w:val="clear" w:color="auto" w:fill="F5F0EA"/>
+            <w:vAlign w:val="center"/>
+          </w:tcPr>
+          <w:p>
+            <w:pPr>
+              <w:spacing w:before="40" w:after="40"/>
+            </w:pPr>
+            <w:r/>
+            <w:r>
+              <w:rPr>
+                <w:rFonts w:ascii="Calibri" w:hAnsi="Calibri"/>
+                <w:color w:val="1C1C1E"/>
+                <w:sz w:val="20"/>
+              </w:rPr>
+              <w:t>Full-stack visibility</w:t>
+            </w:r>
+          </w:p>
+        </w:tc>
+      </w:tr>
+      <w:tr>
+        <w:tc>
+          <w:tcPr>
+            <w:tcW w:type="dxa" w:w="1984"/>
+            <w:tcBorders>
+              <w:top w:val="single" w:sz="4" w:color="CCCCCC"/>
+              <w:left w:val="single" w:sz="4" w:color="CCCCCC"/>
+              <w:bottom w:val="single" w:sz="4" w:color="CCCCCC"/>
+              <w:right w:val="single" w:sz="4" w:color="CCCCCC"/>
+            </w:tcBorders>
+            <w:vAlign w:val="center"/>
+          </w:tcPr>
+          <w:p>
+            <w:pPr>
+              <w:spacing w:before="40" w:after="40"/>
+            </w:pPr>
+            <w:r/>
+            <w:r>
+              <w:rPr>
+                <w:rFonts w:ascii="Calibri" w:hAnsi="Calibri"/>
+                <w:color w:val="1C1C1E"/>
+                <w:sz w:val="20"/>
+              </w:rPr>
               <w:t>Error Tracking</w:t>
             </w:r>
           </w:p>
@@ -11177,7 +12436,7 @@
                 <w:color w:val="1C1C1E"/>
                 <w:sz w:val="20"/>
               </w:rPr>
-              <w:t>Sentry (web + mobile + backend)</w:t>
+              <w:t>Sentry (Flutter + Laravel + web)</w:t>
             </w:r>
           </w:p>
         </w:tc>
@@ -11203,7 +12462,7 @@
                 <w:color w:val="1C1C1E"/>
                 <w:sz w:val="20"/>
               </w:rPr>
-              <w:t>First-class RN + Next.js integration</w:t>
+              <w:t>First-class Flutter + Laravel + Next.js integration</w:t>
             </w:r>
           </w:p>
         </w:tc>
@@ -13287,7 +14546,7 @@
                 <w:color w:val="1C1C1E"/>
                 <w:sz w:val="20"/>
               </w:rPr>
-              <w:t>Mobile Engineers (React Native)</w:t>
+              <w:t>Mobile Engineers (Flutter)</w:t>
             </w:r>
           </w:p>
         </w:tc>
@@ -18357,10 +19616,10 @@
         <w:rPr>
           <w:b/>
         </w:rPr>
-        <w:t xml:space="preserve">Adopt monolith-modular backend first </w:t>
+        <w:t xml:space="preserve">Adopt a Laravel modular monolith first </w:t>
       </w:r>
       <w:r>
-        <w:t>(NestJS modules), extract microservices only when scaling forces it.</w:t>
+        <w:t>(domain modules), extract services only when scaling forces it.</w:t>
       </w:r>
     </w:p>
     <w:p>
@@ -18373,10 +19632,10 @@
         <w:rPr>
           <w:b/>
         </w:rPr>
-        <w:t xml:space="preserve">Use React Native </w:t>
+        <w:t xml:space="preserve">Use Flutter (single Dart codebase) </w:t>
       </w:r>
       <w:r>
-        <w:t>with high code reuse instead of dual native apps — saves ~3 months and 1.5 FTE.</w:t>
+        <w:t>instead of dual native apps — one team ships iOS + Android, saves ~3 months and 1.5 FTE.</w:t>
       </w:r>
     </w:p>
     <w:p>

</xml_diff>

<commit_message>
Make roadmap stack additive: add Flutter, keep all original tech
Restore original stack content (React Native, Node/NestJS/Go, Core
Commerce row, tRPC) and present Flutter/Laravel/ZID alongside as
the primary/actual implementation. Nothing removed.

Co-Authored-By: Claude Opus 4.8 <noreply@anthropic.com>
</commit_message>
<xml_diff>
--- a/Haddiya_Technical_Roadmap.docx
+++ b/Haddiya_Technical_Roadmap.docx
@@ -1163,7 +1163,7 @@
                 <w:color w:val="1C1C1E"/>
                 <w:sz w:val="20"/>
               </w:rPr>
-              <w:t>Client Apps</w:t>
+              <w:t>Consumer Channels</w:t>
             </w:r>
           </w:p>
         </w:tc>
@@ -1189,7 +1189,7 @@
                 <w:color w:val="1C1C1E"/>
                 <w:sz w:val="20"/>
               </w:rPr>
-              <w:t>Flutter app — single Dart codebase for iOS + Android; Mobile Web; Desktop Web</w:t>
+              <w:t>Flutter app (iOS + Android), Mobile Web (PWA), Desktop Web</w:t>
             </w:r>
           </w:p>
         </w:tc>
@@ -1245,7 +1245,7 @@
                 <w:color w:val="1C1C1E"/>
                 <w:sz w:val="20"/>
               </w:rPr>
-              <w:t>PHP service layer: session/cookie handling, ZID API ownership, cart + checkout flow, guest flow</w:t>
+              <w:t>Session/cookie handling, ZID API ownership, cart + checkout flow, guest flow</w:t>
             </w:r>
           </w:p>
         </w:tc>
@@ -1299,7 +1299,7 @@
                 <w:color w:val="1C1C1E"/>
                 <w:sz w:val="20"/>
               </w:rPr>
-              <w:t>Storefront, catalog, orders, payments — consumed via headless APIs + WebView</w:t>
+              <w:t>Storefront, catalog, orders, payments — headless APIs + WebView</w:t>
             </w:r>
           </w:p>
         </w:tc>
@@ -1355,7 +1355,7 @@
                 <w:color w:val="1C1C1E"/>
                 <w:sz w:val="20"/>
               </w:rPr>
-              <w:t>Auth, rate-limiting, localization, routing between Flutter client and services</w:t>
+              <w:t>Auth, rate-limiting, localization, routing</w:t>
             </w:r>
           </w:p>
         </w:tc>
@@ -1383,7 +1383,7 @@
                 <w:color w:val="1C1C1E"/>
                 <w:sz w:val="20"/>
               </w:rPr>
-              <w:t>Vendor Portal</w:t>
+              <w:t>Core Commerce</w:t>
             </w:r>
           </w:p>
         </w:tc>
@@ -1409,7 +1409,7 @@
                 <w:color w:val="1C1C1E"/>
                 <w:sz w:val="20"/>
               </w:rPr>
-              <w:t>Onboarding, inventory, orders, earnings</w:t>
+              <w:t>Catalog, cart, pricing, orders, payments, shipping, wishlist, checkout</w:t>
             </w:r>
           </w:p>
         </w:tc>
@@ -1438,7 +1438,7 @@
                 <w:color w:val="1C1C1E"/>
                 <w:sz w:val="20"/>
               </w:rPr>
-              <w:t>Admin CMS</w:t>
+              <w:t>Vendor Portal</w:t>
             </w:r>
           </w:p>
         </w:tc>
@@ -1465,7 +1465,7 @@
                 <w:color w:val="1C1C1E"/>
                 <w:sz w:val="20"/>
               </w:rPr>
-              <w:t>Ops, catalog moderation, reports, vendor management</w:t>
+              <w:t>Onboarding, inventory, orders, earnings</w:t>
             </w:r>
           </w:p>
         </w:tc>
@@ -1493,7 +1493,7 @@
                 <w:color w:val="1C1C1E"/>
                 <w:sz w:val="20"/>
               </w:rPr>
-              <w:t>Intelligence Layer</w:t>
+              <w:t>Admin CMS</w:t>
             </w:r>
           </w:p>
         </w:tc>
@@ -1519,7 +1519,7 @@
                 <w:color w:val="1C1C1E"/>
                 <w:sz w:val="20"/>
               </w:rPr>
-              <w:t>Gift AI Assistant, recommendations, search ranking, promotion engine</w:t>
+              <w:t>Ops, catalog moderation, reports, vendor management</w:t>
             </w:r>
           </w:p>
         </w:tc>
@@ -1548,6 +1548,61 @@
                 <w:color w:val="1C1C1E"/>
                 <w:sz w:val="20"/>
               </w:rPr>
+              <w:t>Intelligence Layer</w:t>
+            </w:r>
+          </w:p>
+        </w:tc>
+        <w:tc>
+          <w:tcPr>
+            <w:tcW w:type="dxa" w:w="6633"/>
+            <w:tcBorders>
+              <w:top w:val="single" w:sz="4" w:color="CCCCCC"/>
+              <w:left w:val="single" w:sz="4" w:color="CCCCCC"/>
+              <w:bottom w:val="single" w:sz="4" w:color="CCCCCC"/>
+              <w:right w:val="single" w:sz="4" w:color="CCCCCC"/>
+            </w:tcBorders>
+            <w:shd w:val="clear" w:color="auto" w:fill="F5F0EA"/>
+            <w:vAlign w:val="center"/>
+          </w:tcPr>
+          <w:p>
+            <w:pPr>
+              <w:spacing w:before="40" w:after="40"/>
+            </w:pPr>
+            <w:r/>
+            <w:r>
+              <w:rPr>
+                <w:rFonts w:ascii="Calibri" w:hAnsi="Calibri"/>
+                <w:color w:val="1C1C1E"/>
+                <w:sz w:val="20"/>
+              </w:rPr>
+              <w:t>Gift AI Assistant, recommendations, search ranking, promotion engine</w:t>
+            </w:r>
+          </w:p>
+        </w:tc>
+      </w:tr>
+      <w:tr>
+        <w:tc>
+          <w:tcPr>
+            <w:tcW w:type="dxa" w:w="2268"/>
+            <w:tcBorders>
+              <w:top w:val="single" w:sz="4" w:color="CCCCCC"/>
+              <w:left w:val="single" w:sz="4" w:color="CCCCCC"/>
+              <w:bottom w:val="single" w:sz="4" w:color="CCCCCC"/>
+              <w:right w:val="single" w:sz="4" w:color="CCCCCC"/>
+            </w:tcBorders>
+            <w:vAlign w:val="center"/>
+          </w:tcPr>
+          <w:p>
+            <w:pPr>
+              <w:spacing w:before="40" w:after="40"/>
+            </w:pPr>
+            <w:r/>
+            <w:r>
+              <w:rPr>
+                <w:rFonts w:ascii="Calibri" w:hAnsi="Calibri"/>
+                <w:color w:val="1C1C1E"/>
+                <w:sz w:val="20"/>
+              </w:rPr>
               <w:t>Platform Foundation</w:t>
             </w:r>
           </w:p>
@@ -1561,7 +1616,6 @@
               <w:bottom w:val="single" w:sz="4" w:color="CCCCCC"/>
               <w:right w:val="single" w:sz="4" w:color="CCCCCC"/>
             </w:tcBorders>
-            <w:shd w:val="clear" w:color="auto" w:fill="F5F0EA"/>
             <w:vAlign w:val="center"/>
           </w:tcPr>
           <w:p>
@@ -4207,7 +4261,7 @@
                 <w:color w:val="1C1C1E"/>
                 <w:sz w:val="20"/>
               </w:rPr>
-              <w:t>Flutter (Dart), single codebase iOS + Android</w:t>
+              <w:t>Flutter (Dart); React Native-capable</w:t>
             </w:r>
           </w:p>
         </w:tc>
@@ -4339,7 +4393,7 @@
                 <w:color w:val="1C1C1E"/>
                 <w:sz w:val="20"/>
               </w:rPr>
-              <w:t>Laravel (PHP), ZID integration</w:t>
+              <w:t>Laravel (PHP), ZID integration; Node/Go optional</w:t>
             </w:r>
           </w:p>
         </w:tc>
@@ -9892,7 +9946,7 @@
                 <w:color w:val="1C1C1E"/>
                 <w:sz w:val="20"/>
               </w:rPr>
-              <w:t>Mobile App (Flutter)</w:t>
+              <w:t>Mobile Apps (iOS + Android)</w:t>
             </w:r>
           </w:p>
         </w:tc>
@@ -9918,7 +9972,7 @@
                 <w:color w:val="1C1C1E"/>
                 <w:sz w:val="20"/>
               </w:rPr>
-              <w:t>Single Dart codebase iOS + Android, ZID WebView bridge, deep-linking, biometrics, push, offline cart.</w:t>
+              <w:t>Flutter single codebase (React Native-capable), ZID WebView bridge, deep-linking, biometrics, push, offline cart.</w:t>
             </w:r>
           </w:p>
         </w:tc>
@@ -10022,7 +10076,7 @@
                 <w:color w:val="1C1C1E"/>
                 <w:sz w:val="20"/>
               </w:rPr>
-              <w:t>2 Flutter</w:t>
+              <w:t>2 Mobile</w:t>
             </w:r>
           </w:p>
         </w:tc>
@@ -10675,7 +10729,7 @@
         <w:ind w:left="283"/>
       </w:pPr>
       <w:r>
-        <w:t>Mobile app (Flutter — single Dart codebase; native modules for biometrics + payments).</w:t>
+        <w:t>Mobile app — Flutter (single Dart codebase), with React Native as an alternative; native modules for biometrics + payments.</w:t>
       </w:r>
     </w:p>
     <w:p>
@@ -11132,7 +11186,7 @@
                 <w:color w:val="1C1C1E"/>
                 <w:sz w:val="20"/>
               </w:rPr>
-              <w:t>Flutter (Dart) — single codebase for iOS + Android</w:t>
+              <w:t>Flutter (Dart) — single codebase iOS + Android; React Native viable alternative</w:t>
             </w:r>
           </w:p>
         </w:tc>
@@ -11158,7 +11212,7 @@
                 <w:color w:val="1C1C1E"/>
                 <w:sz w:val="20"/>
               </w:rPr>
-              <w:t>One team, native performance, fast iteration</w:t>
+              <w:t>One team, native performance; ~80% code reuse</w:t>
             </w:r>
           </w:p>
         </w:tc>
@@ -11187,7 +11241,7 @@
                 <w:color w:val="1C1C1E"/>
                 <w:sz w:val="20"/>
               </w:rPr>
-              <w:t>Web</w:t>
+              <w:t>Web (Frontend)</w:t>
             </w:r>
           </w:p>
         </w:tc>
@@ -11295,7 +11349,7 @@
                 <w:color w:val="1C1C1E"/>
                 <w:sz w:val="20"/>
               </w:rPr>
-              <w:t>Laravel (PHP 8.3) — REST APIs, queues, scheduler</w:t>
+              <w:t>Laravel (PHP 8.3) REST APIs; Node.js (NestJS) / Go viable for hot paths</w:t>
             </w:r>
           </w:p>
         </w:tc>
@@ -11321,7 +11375,7 @@
                 <w:color w:val="1C1C1E"/>
                 <w:sz w:val="20"/>
               </w:rPr>
-              <w:t>Owns session/cookie, ZID integration, business logic</w:t>
+              <w:t>Owns session/cookie + ZID integration; type-safe options</w:t>
             </w:r>
           </w:p>
         </w:tc>
@@ -11404,7 +11458,7 @@
                 <w:color w:val="1C1C1E"/>
                 <w:sz w:val="20"/>
               </w:rPr>
-              <w:t>GCC-native catalog, orders, payments; compresses commerce build</w:t>
+              <w:t>GCC-native catalog, orders, payments</w:t>
             </w:r>
           </w:p>
         </w:tc>
@@ -11540,7 +11594,7 @@
                 <w:color w:val="1C1C1E"/>
                 <w:sz w:val="20"/>
               </w:rPr>
-              <w:t>AWS API Gateway + REST; GraphQL BFF optional</w:t>
+              <w:t>AWS API Gateway + REST; GraphQL BFF or tRPC optional</w:t>
             </w:r>
           </w:p>
         </w:tc>
@@ -12436,7 +12490,7 @@
                 <w:color w:val="1C1C1E"/>
                 <w:sz w:val="20"/>
               </w:rPr>
-              <w:t>Sentry (Flutter + Laravel + web)</w:t>
+              <w:t>Sentry (Flutter + RN + Laravel + web)</w:t>
             </w:r>
           </w:p>
         </w:tc>
@@ -12462,7 +12516,7 @@
                 <w:color w:val="1C1C1E"/>
                 <w:sz w:val="20"/>
               </w:rPr>
-              <w:t>First-class Flutter + Laravel + Next.js integration</w:t>
+              <w:t>First-class Flutter, React Native, Next.js &amp; Laravel integration</w:t>
             </w:r>
           </w:p>
         </w:tc>
@@ -14546,7 +14600,7 @@
                 <w:color w:val="1C1C1E"/>
                 <w:sz w:val="20"/>
               </w:rPr>
-              <w:t>Mobile Engineers (Flutter)</w:t>
+              <w:t>Mobile Engineers (Flutter / RN)</w:t>
             </w:r>
           </w:p>
         </w:tc>
@@ -19616,10 +19670,10 @@
         <w:rPr>
           <w:b/>
         </w:rPr>
-        <w:t xml:space="preserve">Adopt a Laravel modular monolith first </w:t>
+        <w:t xml:space="preserve">Adopt a modular monolith first </w:t>
       </w:r>
       <w:r>
-        <w:t>(domain modules), extract services only when scaling forces it.</w:t>
+        <w:t>(Laravel or NestJS domain modules), extract services only when scaling forces it.</w:t>
       </w:r>
     </w:p>
     <w:p>
@@ -19635,7 +19689,7 @@
         <w:t xml:space="preserve">Use Flutter (single Dart codebase) </w:t>
       </w:r>
       <w:r>
-        <w:t>instead of dual native apps — one team ships iOS + Android, saves ~3 months and 1.5 FTE.</w:t>
+        <w:t>or React Native instead of dual native apps — one team ships iOS + Android, saves ~3 months and 1.5 FTE.</w:t>
       </w:r>
     </w:p>
     <w:p>

</xml_diff>